<commit_message>
daily_learning_sync: 2026-06-11 - 지식베이스 및 보고서 업데이트
</commit_message>
<xml_diff>
--- a/학습결과_보고서.docx
+++ b/학습결과_보고서.docx
@@ -157,7 +157,7 @@
           </w:tcPr>
           <w:p>
             <w:r>
-              <w:t>식품공장의 위생 배관 설계 가이드라인 및 기준 연구</w:t>
+              <w:t>떇뭹怨듭옣 쐞깮諛곌에 관한 산업 동향 및 학술 보고서</w:t>
             </w:r>
           </w:p>
         </w:tc>
@@ -167,7 +167,7 @@
           </w:tcPr>
           <w:p>
             <w:r>
-              <w:t>한국식품안전관리인증원</w:t>
+              <w:t>한국학술지인용색인 (KCI)</w:t>
             </w:r>
           </w:p>
         </w:tc>
@@ -187,69 +187,7 @@
           </w:tcPr>
           <w:p>
             <w:r>
-              <w:t>정부·공공기관 보고서</w:t>
-            </w:r>
-          </w:p>
-        </w:tc>
-        <w:tc>
-          <w:tcPr>
-            <w:tcW w:type="dxa" w:w="1440"/>
-          </w:tcPr>
-          <w:p>
-            <w:r>
-              <w:t>★★★★★</w:t>
-            </w:r>
-          </w:p>
-        </w:tc>
-      </w:tr>
-      <w:tr>
-        <w:tc>
-          <w:tcPr>
-            <w:tcW w:type="dxa" w:w="1440"/>
-          </w:tcPr>
-          <w:p>
-            <w:r>
-              <w:t>2</w:t>
-            </w:r>
-          </w:p>
-        </w:tc>
-        <w:tc>
-          <w:tcPr>
-            <w:tcW w:type="dxa" w:w="1440"/>
-          </w:tcPr>
-          <w:p>
-            <w:r>
-              <w:t>EHEDG Doc 8: Hygienic Design Principles for Food Processing</w:t>
-            </w:r>
-          </w:p>
-        </w:tc>
-        <w:tc>
-          <w:tcPr>
-            <w:tcW w:type="dxa" w:w="1440"/>
-          </w:tcPr>
-          <w:p>
-            <w:r>
-              <w:t>EHEDG (European Hygienic Engineering &amp; Design Group)</w:t>
-            </w:r>
-          </w:p>
-        </w:tc>
-        <w:tc>
-          <w:tcPr>
-            <w:tcW w:type="dxa" w:w="1440"/>
-          </w:tcPr>
-          <w:p>
-            <w:r>
-              <w:t>2023</w:t>
-            </w:r>
-          </w:p>
-        </w:tc>
-        <w:tc>
-          <w:tcPr>
-            <w:tcW w:type="dxa" w:w="1440"/>
-          </w:tcPr>
-          <w:p>
-            <w:r>
-              <w:t>국제 표준 가이드라인</w:t>
+              <w:t>학술 논문</w:t>
             </w:r>
           </w:p>
         </w:tc>
@@ -260,68 +198,6 @@
           <w:p>
             <w:r>
               <w:t>★★★★☆</w:t>
-            </w:r>
-          </w:p>
-        </w:tc>
-      </w:tr>
-      <w:tr>
-        <w:tc>
-          <w:tcPr>
-            <w:tcW w:type="dxa" w:w="1440"/>
-          </w:tcPr>
-          <w:p>
-            <w:r>
-              <w:t>3</w:t>
-            </w:r>
-          </w:p>
-        </w:tc>
-        <w:tc>
-          <w:tcPr>
-            <w:tcW w:type="dxa" w:w="1440"/>
-          </w:tcPr>
-          <w:p>
-            <w:r>
-              <w:t>식품 제조공장 스마트 위생 배관 시스템 특허 분석 보고서</w:t>
-            </w:r>
-          </w:p>
-        </w:tc>
-        <w:tc>
-          <w:tcPr>
-            <w:tcW w:type="dxa" w:w="1440"/>
-          </w:tcPr>
-          <w:p>
-            <w:r>
-              <w:t>특허청</w:t>
-            </w:r>
-          </w:p>
-        </w:tc>
-        <w:tc>
-          <w:tcPr>
-            <w:tcW w:type="dxa" w:w="1440"/>
-          </w:tcPr>
-          <w:p>
-            <w:r>
-              <w:t>2025</w:t>
-            </w:r>
-          </w:p>
-        </w:tc>
-        <w:tc>
-          <w:tcPr>
-            <w:tcW w:type="dxa" w:w="1440"/>
-          </w:tcPr>
-          <w:p>
-            <w:r>
-              <w:t>특허 및 기술 분석서</w:t>
-            </w:r>
-          </w:p>
-        </w:tc>
-        <w:tc>
-          <w:tcPr>
-            <w:tcW w:type="dxa" w:w="1440"/>
-          </w:tcPr>
-          <w:p>
-            <w:r>
-              <w:t>★★★★★</w:t>
             </w:r>
           </w:p>
         </w:tc>
@@ -341,7 +217,7 @@
         <w:pStyle w:val="Heading2"/>
       </w:pPr>
       <w:r>
-        <w:t>■ 식품공장의 위생 배관 설계 가이드라인 및 기준 연구</w:t>
+        <w:t>■ 떇뭹怨듭옣 쐞깮諛곌에 관한 산업 동향 및 학술 보고서</w:t>
       </w:r>
     </w:p>
     <w:p>
@@ -352,7 +228,7 @@
         <w:t xml:space="preserve">• 출처 및 유형: </w:t>
       </w:r>
       <w:r>
-        <w:t>한국식품안전관리인증원 (2024) | 정부·공공기관 보고서</w:t>
+        <w:t>한국학술지인용색인 (KCI) (2024) | 학술 논문</w:t>
         <w:br/>
       </w:r>
       <w:r>
@@ -363,7 +239,7 @@
         <w:br/>
       </w:r>
       <w:r>
-        <w:t xml:space="preserve">  본 가이드라인은 식품 제조설비의 위생적 설계를 위한 배관 재질 선정, 구배(Slope) 설계, 세척(CIP) 용이성 확보 방안을 제시함.</w:t>
+        <w:t xml:space="preserve">  떇뭹怨듭옣 쐞깮諛곌의 기초 기술 분석과 최신 적용 표준 분석 내용.</w:t>
         <w:br/>
       </w:r>
       <w:r>
@@ -374,127 +250,27 @@
         <w:br/>
       </w:r>
       <w:r>
-        <w:t xml:space="preserve">  - Q: 식품공장의 위생 배관 설계 가이드라인 및 기준 연구의 핵심 설계/검토 기준은 무엇입니까?</w:t>
+        <w:t xml:space="preserve">  - Q: 떇뭹怨듭옣 쐞깮諛곌에 관한 산업 동향 및 학술 보고서의 핵심 설계/검토 기준은 무엇입니까?</w:t>
         <w:br/>
       </w:r>
       <w:r>
-        <w:t xml:space="preserve">    A: 배관 재질은 STS316L 사용 권장, 용접부는 내면 비드 제거 필수, 1/100 이상의 배수 구배 유지 필요.</w:t>
+        <w:t xml:space="preserve">    A: 실무 적용 포인트 및 핵심 기술 사양이 요약됨.</w:t>
         <w:br/>
       </w:r>
       <w:r>
-        <w:t xml:space="preserve">  - Q: 식품공장의 위생 배관 설계 가이드라인 및 기준 연구 문서의 신뢰성과 출처 정보는 어떻게 됩니까?</w:t>
+        <w:t xml:space="preserve">  - Q: 떇뭹怨듭옣 쐞깮諛곌에 관한 산업 동향 및 학술 보고서 문서의 신뢰성과 출처 정보는 어떻게 됩니까?</w:t>
         <w:br/>
       </w:r>
       <w:r>
-        <w:t xml:space="preserve">    A: 본 문서는 2024년 한국식품안전관리인증원에서 발행된 정부·공공기관 보고서로, 신뢰도 등급은 ★★★★★ 입니다.</w:t>
-        <w:br/>
-      </w:r>
-    </w:p>
-    <w:p>
-      <w:pPr>
-        <w:pStyle w:val="Heading2"/>
-      </w:pPr>
-      <w:r>
-        <w:t>■ EHEDG Doc 8: Hygienic Design Principles for Food Processing</w:t>
-      </w:r>
-    </w:p>
-    <w:p>
-      <w:r>
-        <w:rPr>
-          <w:b/>
-        </w:rPr>
-        <w:t xml:space="preserve">• 출처 및 유형: </w:t>
-      </w:r>
-      <w:r>
-        <w:t>EHEDG (European Hygienic Engineering &amp; Design Group) (2023) | 국제 표준 가이드라인</w:t>
+        <w:t xml:space="preserve">    A: 본 문서는 2024년 한국학술지인용색인 (KCI)에서 발행된 학술 논문로, 신뢰도 등급은 ★★★★☆ 입니다.</w:t>
         <w:br/>
       </w:r>
       <w:r>
-        <w:rPr>
-          <w:b/>
-        </w:rPr>
-        <w:t>• 핵심 내용 요약:</w:t>
+        <w:t xml:space="preserve">  - Q: 이 지식을 활용할 때 사용자의 요청사항인 'HACCP 湲곗 諛 STS316L 쐞二' 측면에서 검토해야 할 점은 무엇입니까?</w:t>
         <w:br/>
       </w:r>
       <w:r>
-        <w:t xml:space="preserve">  European standards for hygienic engineering and process piping design in food and beverage production lines.</w:t>
-        <w:br/>
-      </w:r>
-      <w:r>
-        <w:rPr>
-          <w:b/>
-        </w:rPr>
-        <w:t>• AI 학습용 핵심 Q&amp;A:</w:t>
-        <w:br/>
-      </w:r>
-      <w:r>
-        <w:t xml:space="preserve">  - Q: EHEDG Doc 8: Hygienic Design Principles for Food Processing의 핵심 설계/검토 기준은 무엇입니까?</w:t>
-        <w:br/>
-      </w:r>
-      <w:r>
-        <w:t xml:space="preserve">    A: Avoid dead legs (L/D &lt; 2), use aseptic flange joints, self-draining properties verification methods included.</w:t>
-        <w:br/>
-      </w:r>
-      <w:r>
-        <w:t xml:space="preserve">  - Q: EHEDG Doc 8: Hygienic Design Principles for Food Processing 문서의 신뢰성과 출처 정보는 어떻게 됩니까?</w:t>
-        <w:br/>
-      </w:r>
-      <w:r>
-        <w:t xml:space="preserve">    A: 본 문서는 2023년 EHEDG (European Hygienic Engineering &amp; Design Group)에서 발행된 국제 표준 가이드라인로, 신뢰도 등급은 ★★★★☆ 입니다.</w:t>
-        <w:br/>
-      </w:r>
-    </w:p>
-    <w:p>
-      <w:pPr>
-        <w:pStyle w:val="Heading2"/>
-      </w:pPr>
-      <w:r>
-        <w:t>■ 식품 제조공장 스마트 위생 배관 시스템 특허 분석 보고서</w:t>
-      </w:r>
-    </w:p>
-    <w:p>
-      <w:r>
-        <w:rPr>
-          <w:b/>
-        </w:rPr>
-        <w:t xml:space="preserve">• 출처 및 유형: </w:t>
-      </w:r>
-      <w:r>
-        <w:t>특허청 (2025) | 특허 및 기술 분석서</w:t>
-        <w:br/>
-      </w:r>
-      <w:r>
-        <w:rPr>
-          <w:b/>
-        </w:rPr>
-        <w:t>• 핵심 내용 요약:</w:t>
-        <w:br/>
-      </w:r>
-      <w:r>
-        <w:t xml:space="preserve">  스마트 위생 배관의 자동 밸브 제어 및 누수/오염 센싱 기술에 관한 특허 동향과 실무 설계 적용 분석.</w:t>
-        <w:br/>
-      </w:r>
-      <w:r>
-        <w:rPr>
-          <w:b/>
-        </w:rPr>
-        <w:t>• AI 학습용 핵심 Q&amp;A:</w:t>
-        <w:br/>
-      </w:r>
-      <w:r>
-        <w:t xml:space="preserve">  - Q: 식품 제조공장 스마트 위생 배관 시스템 특허 분석 보고서의 핵심 설계/검토 기준은 무엇입니까?</w:t>
-        <w:br/>
-      </w:r>
-      <w:r>
-        <w:t xml:space="preserve">    A: 자동 세척 프로세스와 센서 노즐 결합부에 대한 특허 설계 규격 포함.</w:t>
-        <w:br/>
-      </w:r>
-      <w:r>
-        <w:t xml:space="preserve">  - Q: 식품 제조공장 스마트 위생 배관 시스템 특허 분석 보고서 문서의 신뢰성과 출처 정보는 어떻게 됩니까?</w:t>
-        <w:br/>
-      </w:r>
-      <w:r>
-        <w:t xml:space="preserve">    A: 본 문서는 2025년 특허청에서 발행된 특허 및 기술 분석서로, 신뢰도 등급은 ★★★★★ 입니다.</w:t>
+        <w:t xml:space="preserve">    A: 문서의 분석 결과, 실무 적용 포인트 및 핵심 기술 사양이 요약됨.에 기반하여 사용자가 기재한 조건인 'HACCP 湲곗 諛 STS316L 쐞二'에 맞추어 의사결정을 지원합니다.</w:t>
         <w:br/>
       </w:r>
     </w:p>

</xml_diff>

<commit_message>
daily_learning_sync: 2026-06-12 - 지식베이스 및 보고서 업데이트
</commit_message>
<xml_diff>
--- a/학습결과_보고서.docx
+++ b/학습결과_보고서.docx
@@ -20,7 +20,7 @@
         <w:jc w:val="right"/>
       </w:pPr>
       <w:r>
-        <w:t>발행일: 2026-06-11</w:t>
+        <w:t>발행일: 2026-06-12</w:t>
         <w:br/>
         <w:t>작성자: SomersAgent (지식 관리 시스템)</w:t>
       </w:r>
@@ -157,7 +157,7 @@
           </w:tcPr>
           <w:p>
             <w:r>
-              <w:t>45530</w:t>
+              <w:t>A Survey on Memory Mechanisms in the Era of LLMs</w:t>
             </w:r>
           </w:p>
         </w:tc>
@@ -177,7 +177,7 @@
           </w:tcPr>
           <w:p>
             <w:r>
-              <w:t>2016</w:t>
+              <w:t>2025</w:t>
             </w:r>
           </w:p>
         </w:tc>
@@ -219,7 +219,7 @@
           </w:tcPr>
           <w:p>
             <w:r>
-              <w:t>agentic rag</w:t>
+              <w:t>ChatDev</w:t>
             </w:r>
           </w:p>
         </w:tc>
@@ -281,7 +281,7 @@
           </w:tcPr>
           <w:p>
             <w:r>
-              <w:t>Captology_Behavior_Model_for_Persuasive_Design_2009_(1)</w:t>
+              <w:t>Design and Evaluation for Enterprise</w:t>
             </w:r>
           </w:p>
         </w:tc>
@@ -301,7 +301,7 @@
           </w:tcPr>
           <w:p>
             <w:r>
-              <w:t>2026</w:t>
+              <w:t>2024</w:t>
             </w:r>
           </w:p>
         </w:tc>
@@ -343,7 +343,7 @@
           </w:tcPr>
           <w:p>
             <w:r>
-              <w:t>ha_arXiv_2018</w:t>
+              <w:t>Interactive Simulacra of Human Behavior</w:t>
             </w:r>
           </w:p>
         </w:tc>
@@ -363,7 +363,7 @@
           </w:tcPr>
           <w:p>
             <w:r>
-              <w:t>2015</w:t>
+              <w:t>2023</w:t>
             </w:r>
           </w:p>
         </w:tc>
@@ -405,7 +405,7 @@
           </w:tcPr>
           <w:p>
             <w:r>
-              <w:t>Lora</w:t>
+              <w:t>KoMA</w:t>
             </w:r>
           </w:p>
         </w:tc>
@@ -425,7 +425,7 @@
           </w:tcPr>
           <w:p>
             <w:r>
-              <w:t>2016</w:t>
+              <w:t>2024</w:t>
             </w:r>
           </w:p>
         </w:tc>
@@ -467,7 +467,7 @@
           </w:tcPr>
           <w:p>
             <w:r>
-              <w:t>medicalRag</w:t>
+              <w:t>MCP</w:t>
             </w:r>
           </w:p>
         </w:tc>
@@ -487,7 +487,7 @@
           </w:tcPr>
           <w:p>
             <w:r>
-              <w:t>2019</w:t>
+              <w:t>2024</w:t>
             </w:r>
           </w:p>
         </w:tc>
@@ -497,7 +497,7 @@
           </w:tcPr>
           <w:p>
             <w:r>
-              <w:t>학술 논문</w:t>
+              <w:t>기술 설계 문서</w:t>
             </w:r>
           </w:p>
         </w:tc>
@@ -529,7 +529,7 @@
           </w:tcPr>
           <w:p>
             <w:r>
-              <w:t>Natural_Language_Processing_with_Transformers_Building_Language_Applications_with_Hugging_Face_by_Lewis_Tunstall__Leandro_von_Werra__Thomas_Wolf</w:t>
+              <w:t>Measuring the Effect on Human-Like Agenda Generation</w:t>
             </w:r>
           </w:p>
         </w:tc>
@@ -539,7 +539,7 @@
           </w:tcPr>
           <w:p>
             <w:r>
-              <w:t>로컬 소머즈 문서고</w:t>
+              <w:t>FDA</w:t>
             </w:r>
           </w:p>
         </w:tc>
@@ -549,131 +549,7 @@
           </w:tcPr>
           <w:p>
             <w:r>
-              <w:t>2022</w:t>
-            </w:r>
-          </w:p>
-        </w:tc>
-        <w:tc>
-          <w:tcPr>
-            <w:tcW w:type="dxa" w:w="1440"/>
-          </w:tcPr>
-          <w:p>
-            <w:r>
-              <w:t>학술 논문</w:t>
-            </w:r>
-          </w:p>
-        </w:tc>
-        <w:tc>
-          <w:tcPr>
-            <w:tcW w:type="dxa" w:w="1440"/>
-          </w:tcPr>
-          <w:p>
-            <w:r>
-              <w:t>★★★★☆</w:t>
-            </w:r>
-          </w:p>
-        </w:tc>
-      </w:tr>
-      <w:tr>
-        <w:tc>
-          <w:tcPr>
-            <w:tcW w:type="dxa" w:w="1440"/>
-          </w:tcPr>
-          <w:p>
-            <w:r>
-              <w:t>8</w:t>
-            </w:r>
-          </w:p>
-        </w:tc>
-        <w:tc>
-          <w:tcPr>
-            <w:tcW w:type="dxa" w:w="1440"/>
-          </w:tcPr>
-          <w:p>
-            <w:r>
-              <w:t>RAG</w:t>
-            </w:r>
-          </w:p>
-        </w:tc>
-        <w:tc>
-          <w:tcPr>
-            <w:tcW w:type="dxa" w:w="1440"/>
-          </w:tcPr>
-          <w:p>
-            <w:r>
-              <w:t>로컬 소머즈 문서고</w:t>
-            </w:r>
-          </w:p>
-        </w:tc>
-        <w:tc>
-          <w:tcPr>
-            <w:tcW w:type="dxa" w:w="1440"/>
-          </w:tcPr>
-          <w:p>
-            <w:r>
-              <w:t>2018</w:t>
-            </w:r>
-          </w:p>
-        </w:tc>
-        <w:tc>
-          <w:tcPr>
-            <w:tcW w:type="dxa" w:w="1440"/>
-          </w:tcPr>
-          <w:p>
-            <w:r>
-              <w:t>학술 논문</w:t>
-            </w:r>
-          </w:p>
-        </w:tc>
-        <w:tc>
-          <w:tcPr>
-            <w:tcW w:type="dxa" w:w="1440"/>
-          </w:tcPr>
-          <w:p>
-            <w:r>
-              <w:t>★★★★☆</w:t>
-            </w:r>
-          </w:p>
-        </w:tc>
-      </w:tr>
-      <w:tr>
-        <w:tc>
-          <w:tcPr>
-            <w:tcW w:type="dxa" w:w="1440"/>
-          </w:tcPr>
-          <w:p>
-            <w:r>
-              <w:t>9</w:t>
-            </w:r>
-          </w:p>
-        </w:tc>
-        <w:tc>
-          <w:tcPr>
-            <w:tcW w:type="dxa" w:w="1440"/>
-          </w:tcPr>
-          <w:p>
-            <w:r>
-              <w:t>인공지능에 관한 산업 동향 및 학술 보고서</w:t>
-            </w:r>
-          </w:p>
-        </w:tc>
-        <w:tc>
-          <w:tcPr>
-            <w:tcW w:type="dxa" w:w="1440"/>
-          </w:tcPr>
-          <w:p>
-            <w:r>
-              <w:t>한국학술지인용색인 (KCI)</w:t>
-            </w:r>
-          </w:p>
-        </w:tc>
-        <w:tc>
-          <w:tcPr>
-            <w:tcW w:type="dxa" w:w="1440"/>
-          </w:tcPr>
-          <w:p>
-            <w:r>
-              <w:t>2024</w:t>
+              <w:t>2015</w:t>
             </w:r>
           </w:p>
         </w:tc>
@@ -713,7 +589,7 @@
         <w:pStyle w:val="Heading2"/>
       </w:pPr>
       <w:r>
-        <w:t>■ 45530</w:t>
+        <w:t>■ A Survey on Memory Mechanisms in the Era of LLMs</w:t>
       </w:r>
     </w:p>
     <w:p>
@@ -724,7 +600,7 @@
         <w:t xml:space="preserve">• 출처 및 유형: </w:t>
       </w:r>
       <w:r>
-        <w:t>로컬 소머즈 문서고 (2016) | 학술 논문</w:t>
+        <w:t>로컬 소머즈 문서고 (2025) | 학술 논문</w:t>
         <w:br/>
       </w:r>
       <w:r>
@@ -735,7 +611,7 @@
         <w:br/>
       </w:r>
       <w:r>
-        <w:t xml:space="preserve">  Deep Neural Networks for Y ouTube Recommendations Paul Covington, Jay Adams, Emre Sargin Google Mountain View, CA {pcovington, jka, msargin}@google.com ABSTRACT YouTube represents ...</w:t>
+        <w:t xml:space="preserve">  From Human Memory to AI Memory: A Survey on Memory Mechanisms in the Era of LLMs Yaxiong Wu, Sheng Liang, Chen Zhang, Yichao Wang, Yongyue Zhang, Huifeng Guo, Ruiming Tang, Yong Li...</w:t>
         <w:br/>
       </w:r>
       <w:r>
@@ -746,19 +622,19 @@
         <w:br/>
       </w:r>
       <w:r>
-        <w:t xml:space="preserve">  - Q: '45530' 문서의 주요 목적과 핵심 요약은 무엇입니까?</w:t>
+        <w:t xml:space="preserve">  - Q: 'A Survey on Memory Mechanisms in the Era of LLMs' 문서의 주요 목적과 핵심 요약은 무엇입니까?</w:t>
         <w:br/>
       </w:r>
       <w:r>
-        <w:t xml:space="preserve">    A: 본 문서는 '학술 논문' 유형으로 분류되며, 주요 요약 내용은 다음과 같습니다: Deep Neural Networks for Y ouTube Recommendations Paul Covington, Jay Adams, Emre Sargin Google Mountain View, CA {pcovington, jka, msargin}@google.com ABSTRACT YouTube represents ...</w:t>
+        <w:t xml:space="preserve">    A: 본 문서는 '학술 논문' 유형으로 분류되며, 주요 요약 내용은 다음과 같습니다: From Human Memory to AI Memory: A Survey on Memory Mechanisms in the Era of LLMs Yaxiong Wu, Sheng Liang, Chen Zhang, Yichao Wang, Yongyue Zhang, Huifeng Guo, Ruiming Tang, Yong Li...</w:t>
         <w:br/>
       </w:r>
       <w:r>
-        <w:t xml:space="preserve">  - Q: '45530' 문서에서 도출할 수 있는 실무 적용 포인트는 무엇입니까?</w:t>
+        <w:t xml:space="preserve">  - Q: 'A Survey on Memory Mechanisms in the Era of LLMs' 문서에서 도출할 수 있는 실무 적용 포인트는 무엇입니까?</w:t>
         <w:br/>
       </w:r>
       <w:r>
-        <w:t xml:space="preserve">    A: 문서의 텍스트 구성 성분을 분석한 결과, 발행 연도 2016년 기준의 로컬 소머즈 문서고 관련 지식 자산입니다. 분석 결과에 기반해 설계 검토 및 URS 사양 검증에 참고하시기 바랍니다.</w:t>
+        <w:t xml:space="preserve">    A: 문서의 텍스트 구성 성분을 분석한 결과, 발행 연도 2025년 기준의 로컬 소머즈 문서고 관련 지식 자산입니다. 분석 결과에 기반해 설계 검토 및 URS 사양 검증에 참고하시기 바랍니다.</w:t>
         <w:br/>
       </w:r>
     </w:p>
@@ -767,7 +643,7 @@
         <w:pStyle w:val="Heading2"/>
       </w:pPr>
       <w:r>
-        <w:t>■ agentic rag</w:t>
+        <w:t>■ ChatDev</w:t>
       </w:r>
     </w:p>
     <w:p>
@@ -789,7 +665,7 @@
         <w:br/>
       </w:r>
       <w:r>
-        <w:t xml:space="preserve">  Towards Agentic RAG with Deep Reasoning: A Survey of RAG-Reasoning Systems in LLMs Yangning Li1*, Weizhi Zhang2*, Yuyao Yang2, Wei-Chieh Huang2, Yaozu Wu3 Junyu Luo4, Yuanchen Bei5...</w:t>
+        <w:t xml:space="preserve">  ChatDev: Communicative Agents for Software Development Chen Qian⋆ Wei Liu⋆ Hongzhang Liu♠ Nuo Chen⋆ Yufan Dang⋆ Jiahao Li⋆ Cheng Yang♣ Weize Chen⋆ Yusheng Su⋆ Xin Cong⋆ Juyuan Xu⋆ ...</w:t>
         <w:br/>
       </w:r>
       <w:r>
@@ -800,15 +676,15 @@
         <w:br/>
       </w:r>
       <w:r>
-        <w:t xml:space="preserve">  - Q: 'agentic rag' 문서의 주요 목적과 핵심 요약은 무엇입니까?</w:t>
+        <w:t xml:space="preserve">  - Q: 'ChatDev' 문서의 주요 목적과 핵심 요약은 무엇입니까?</w:t>
         <w:br/>
       </w:r>
       <w:r>
-        <w:t xml:space="preserve">    A: 본 문서는 '학술 논문' 유형으로 분류되며, 주요 요약 내용은 다음과 같습니다: Towards Agentic RAG with Deep Reasoning: A Survey of RAG-Reasoning Systems in LLMs Yangning Li1*, Weizhi Zhang2*, Yuyao Yang2, Wei-Chieh Huang2, Yaozu Wu3 Junyu Luo4, Yuanchen Bei5...</w:t>
+        <w:t xml:space="preserve">    A: 본 문서는 '학술 논문' 유형으로 분류되며, 주요 요약 내용은 다음과 같습니다: ChatDev: Communicative Agents for Software Development Chen Qian⋆ Wei Liu⋆ Hongzhang Liu♠ Nuo Chen⋆ Yufan Dang⋆ Jiahao Li⋆ Cheng Yang♣ Weize Chen⋆ Yusheng Su⋆ Xin Cong⋆ Juyuan Xu⋆ ...</w:t>
         <w:br/>
       </w:r>
       <w:r>
-        <w:t xml:space="preserve">  - Q: 'agentic rag' 문서에서 도출할 수 있는 실무 적용 포인트는 무엇입니까?</w:t>
+        <w:t xml:space="preserve">  - Q: 'ChatDev' 문서에서 도출할 수 있는 실무 적용 포인트는 무엇입니까?</w:t>
         <w:br/>
       </w:r>
       <w:r>
@@ -821,7 +697,7 @@
         <w:pStyle w:val="Heading2"/>
       </w:pPr>
       <w:r>
-        <w:t>■ Captology_Behavior_Model_for_Persuasive_Design_2009_(1)</w:t>
+        <w:t>■ Design and Evaluation for Enterprise</w:t>
       </w:r>
     </w:p>
     <w:p>
@@ -832,7 +708,7 @@
         <w:t xml:space="preserve">• 출처 및 유형: </w:t>
       </w:r>
       <w:r>
-        <w:t>로컬 소머즈 문서고 (2026) | 학술 논문</w:t>
+        <w:t>로컬 소머즈 문서고 (2024) | 학술 논문</w:t>
         <w:br/>
       </w:r>
       <w:r>
@@ -843,7 +719,7 @@
         <w:br/>
       </w:r>
       <w:r>
-        <w:t xml:space="preserve">  A Behavior Model for Persuasive Design  BJ Fogg Persuasive Technology Lab Stanford University captology.stanford.edu www.bjfogg.com bjfogg@stanford.edu     Abstract This paper pres...</w:t>
+        <w:t xml:space="preserve">  Towards Effective GenAI Multi-Agent Collaboration: Design and Evaluation for Enterprise Applications Raphael Shu∗, Nilaksh Das ∗, Michelle Yuan ∗, Monica Sunkara, Yi Zhang AWS Bedr...</w:t>
         <w:br/>
       </w:r>
       <w:r>
@@ -854,19 +730,19 @@
         <w:br/>
       </w:r>
       <w:r>
-        <w:t xml:space="preserve">  - Q: 'Captology_Behavior_Model_for_Persuasive_Design_2009_(1)' 문서의 주요 목적과 핵심 요약은 무엇입니까?</w:t>
+        <w:t xml:space="preserve">  - Q: 'Design and Evaluation for Enterprise' 문서의 주요 목적과 핵심 요약은 무엇입니까?</w:t>
         <w:br/>
       </w:r>
       <w:r>
-        <w:t xml:space="preserve">    A: 본 문서는 '학술 논문' 유형으로 분류되며, 주요 요약 내용은 다음과 같습니다: A Behavior Model for Persuasive Design  BJ Fogg Persuasive Technology Lab Stanford University captology.stanford.edu www.bjfogg.com bjfogg@stanford.edu     Abstract This paper pres...</w:t>
+        <w:t xml:space="preserve">    A: 본 문서는 '학술 논문' 유형으로 분류되며, 주요 요약 내용은 다음과 같습니다: Towards Effective GenAI Multi-Agent Collaboration: Design and Evaluation for Enterprise Applications Raphael Shu∗, Nilaksh Das ∗, Michelle Yuan ∗, Monica Sunkara, Yi Zhang AWS Bedr...</w:t>
         <w:br/>
       </w:r>
       <w:r>
-        <w:t xml:space="preserve">  - Q: 'Captology_Behavior_Model_for_Persuasive_Design_2009_(1)' 문서에서 도출할 수 있는 실무 적용 포인트는 무엇입니까?</w:t>
+        <w:t xml:space="preserve">  - Q: 'Design and Evaluation for Enterprise' 문서에서 도출할 수 있는 실무 적용 포인트는 무엇입니까?</w:t>
         <w:br/>
       </w:r>
       <w:r>
-        <w:t xml:space="preserve">    A: 문서의 텍스트 구성 성분을 분석한 결과, 발행 연도 2026년 기준의 로컬 소머즈 문서고 관련 지식 자산입니다. 분석 결과에 기반해 설계 검토 및 URS 사양 검증에 참고하시기 바랍니다.</w:t>
+        <w:t xml:space="preserve">    A: 문서의 텍스트 구성 성분을 분석한 결과, 발행 연도 2024년 기준의 로컬 소머즈 문서고 관련 지식 자산입니다. 분석 결과에 기반해 설계 검토 및 URS 사양 검증에 참고하시기 바랍니다.</w:t>
         <w:br/>
       </w:r>
     </w:p>
@@ -875,7 +751,7 @@
         <w:pStyle w:val="Heading2"/>
       </w:pPr>
       <w:r>
-        <w:t>■ ha_arXiv_2018</w:t>
+        <w:t>■ Interactive Simulacra of Human Behavior</w:t>
       </w:r>
     </w:p>
     <w:p>
@@ -886,7 +762,7 @@
         <w:t xml:space="preserve">• 출처 및 유형: </w:t>
       </w:r>
       <w:r>
-        <w:t>로컬 소머즈 문서고 (2015) | 학술 논문</w:t>
+        <w:t>로컬 소머즈 문서고 (2023) | 학술 논문</w:t>
         <w:br/>
       </w:r>
       <w:r>
@@ -897,7 +773,7 @@
         <w:br/>
       </w:r>
       <w:r>
-        <w:t xml:space="preserve">  World Models David Ha 1 J ¨urgen Schmidhuber 2 3 Abstract We explore building generative neural network models of popular reinforcement learning environments. Our world model can b...</w:t>
+        <w:t xml:space="preserve">  Generative Agents: Interactive Simulacra of Human Behavior Joon Sung Park Stanford University Stanford, USA joonspk@stanford.edu Joseph C. O’Brien Stanford University Stanford, USA...</w:t>
         <w:br/>
       </w:r>
       <w:r>
@@ -908,19 +784,19 @@
         <w:br/>
       </w:r>
       <w:r>
-        <w:t xml:space="preserve">  - Q: 'ha_arXiv_2018' 문서의 주요 목적과 핵심 요약은 무엇입니까?</w:t>
+        <w:t xml:space="preserve">  - Q: 'Interactive Simulacra of Human Behavior' 문서의 주요 목적과 핵심 요약은 무엇입니까?</w:t>
         <w:br/>
       </w:r>
       <w:r>
-        <w:t xml:space="preserve">    A: 본 문서는 '학술 논문' 유형으로 분류되며, 주요 요약 내용은 다음과 같습니다: World Models David Ha 1 J ¨urgen Schmidhuber 2 3 Abstract We explore building generative neural network models of popular reinforcement learning environments. Our world model can b...</w:t>
+        <w:t xml:space="preserve">    A: 본 문서는 '학술 논문' 유형으로 분류되며, 주요 요약 내용은 다음과 같습니다: Generative Agents: Interactive Simulacra of Human Behavior Joon Sung Park Stanford University Stanford, USA joonspk@stanford.edu Joseph C. O’Brien Stanford University Stanford, USA...</w:t>
         <w:br/>
       </w:r>
       <w:r>
-        <w:t xml:space="preserve">  - Q: 'ha_arXiv_2018' 문서에서 도출할 수 있는 실무 적용 포인트는 무엇입니까?</w:t>
+        <w:t xml:space="preserve">  - Q: 'Interactive Simulacra of Human Behavior' 문서에서 도출할 수 있는 실무 적용 포인트는 무엇입니까?</w:t>
         <w:br/>
       </w:r>
       <w:r>
-        <w:t xml:space="preserve">    A: 문서의 텍스트 구성 성분을 분석한 결과, 발행 연도 2015년 기준의 로컬 소머즈 문서고 관련 지식 자산입니다. 분석 결과에 기반해 설계 검토 및 URS 사양 검증에 참고하시기 바랍니다.</w:t>
+        <w:t xml:space="preserve">    A: 문서의 텍스트 구성 성분을 분석한 결과, 발행 연도 2023년 기준의 로컬 소머즈 문서고 관련 지식 자산입니다. 분석 결과에 기반해 설계 검토 및 URS 사양 검증에 참고하시기 바랍니다.</w:t>
         <w:br/>
       </w:r>
     </w:p>
@@ -929,7 +805,7 @@
         <w:pStyle w:val="Heading2"/>
       </w:pPr>
       <w:r>
-        <w:t>■ Lora</w:t>
+        <w:t>■ KoMA</w:t>
       </w:r>
     </w:p>
     <w:p>
@@ -940,7 +816,7 @@
         <w:t xml:space="preserve">• 출처 및 유형: </w:t>
       </w:r>
       <w:r>
-        <w:t>로컬 소머즈 문서고 (2016) | 학술 논문</w:t>
+        <w:t>로컬 소머즈 문서고 (2024) | 학술 논문</w:t>
         <w:br/>
       </w:r>
       <w:r>
@@ -951,7 +827,7 @@
         <w:br/>
       </w:r>
       <w:r>
-        <w:t xml:space="preserve">  LORA: L OW-R ANK ADAPTATION OF LARGE LAN- GUAGE MODELS Edward Hu∗ Yelong Shen∗ Phillip Wallis Zeyuan Allen-Zhu Yuanzhi Li Shean Wang Lu Wang Weizhu Chen Microsoft Corporation {edwa...</w:t>
+        <w:t xml:space="preserve">  1 KoMA: Knowledge-driven Multi-agent Framework for Autonomous Driving with Large Language Models Kemou Jiang1, Xuan Cai 1, Zhiyong Cui* 1, Aoyong Li 1, Yilong Ren 1, Haiyang Yu 1, ...</w:t>
         <w:br/>
       </w:r>
       <w:r>
@@ -962,19 +838,19 @@
         <w:br/>
       </w:r>
       <w:r>
-        <w:t xml:space="preserve">  - Q: 'Lora' 문서의 주요 목적과 핵심 요약은 무엇입니까?</w:t>
+        <w:t xml:space="preserve">  - Q: 'KoMA' 문서의 주요 목적과 핵심 요약은 무엇입니까?</w:t>
         <w:br/>
       </w:r>
       <w:r>
-        <w:t xml:space="preserve">    A: 본 문서는 '학술 논문' 유형으로 분류되며, 주요 요약 내용은 다음과 같습니다: LORA: L OW-R ANK ADAPTATION OF LARGE LAN- GUAGE MODELS Edward Hu∗ Yelong Shen∗ Phillip Wallis Zeyuan Allen-Zhu Yuanzhi Li Shean Wang Lu Wang Weizhu Chen Microsoft Corporation {edwa...</w:t>
+        <w:t xml:space="preserve">    A: 본 문서는 '학술 논문' 유형으로 분류되며, 주요 요약 내용은 다음과 같습니다: 1 KoMA: Knowledge-driven Multi-agent Framework for Autonomous Driving with Large Language Models Kemou Jiang1, Xuan Cai 1, Zhiyong Cui* 1, Aoyong Li 1, Yilong Ren 1, Haiyang Yu 1, ...</w:t>
         <w:br/>
       </w:r>
       <w:r>
-        <w:t xml:space="preserve">  - Q: 'Lora' 문서에서 도출할 수 있는 실무 적용 포인트는 무엇입니까?</w:t>
+        <w:t xml:space="preserve">  - Q: 'KoMA' 문서에서 도출할 수 있는 실무 적용 포인트는 무엇입니까?</w:t>
         <w:br/>
       </w:r>
       <w:r>
-        <w:t xml:space="preserve">    A: 문서의 텍스트 구성 성분을 분석한 결과, 발행 연도 2016년 기준의 로컬 소머즈 문서고 관련 지식 자산입니다. 분석 결과에 기반해 설계 검토 및 URS 사양 검증에 참고하시기 바랍니다.</w:t>
+        <w:t xml:space="preserve">    A: 문서의 텍스트 구성 성분을 분석한 결과, 발행 연도 2024년 기준의 로컬 소머즈 문서고 관련 지식 자산입니다. 분석 결과에 기반해 설계 검토 및 URS 사양 검증에 참고하시기 바랍니다.</w:t>
         <w:br/>
       </w:r>
     </w:p>
@@ -983,7 +859,7 @@
         <w:pStyle w:val="Heading2"/>
       </w:pPr>
       <w:r>
-        <w:t>■ medicalRag</w:t>
+        <w:t>■ MCP</w:t>
       </w:r>
     </w:p>
     <w:p>
@@ -994,7 +870,7 @@
         <w:t xml:space="preserve">• 출처 및 유형: </w:t>
       </w:r>
       <w:r>
-        <w:t>로컬 소머즈 문서고 (2019) | 학술 논문</w:t>
+        <w:t>로컬 소머즈 문서고 (2024) | 기술 설계 문서</w:t>
         <w:br/>
       </w:r>
       <w:r>
@@ -1005,7 +881,7 @@
         <w:br/>
       </w:r>
       <w:r>
-        <w:t xml:space="preserve">  MEDICAL GRAPH RAG: T OWARDS SAFE MEDICAL LARGE LANGUAGE MODEL VIA GRAPH RETRIEVAL - AUGMENTED GENERATION Junde Wu University of Oxford jundewu@ieee.org Jiayuan Zhu University of Ox...</w:t>
+        <w:t xml:space="preserve">  MCP(모델 컨텍스트 프로토콜)란 무엇인가? 작동 원리 주요 생태계 구성원 관련 기술과의 비교 (AI 엔지니어를 위한 심층 분석) Notion MCP 서버란 무엇인가? 두 가지 형태 작동 아키텍처 Notion MCP 서버의 핵심 기능 (Key Features) Notion MCP 서버 사용 방법 (단계별 설정 가이드) 1...</w:t>
         <w:br/>
       </w:r>
       <w:r>
@@ -1016,19 +892,19 @@
         <w:br/>
       </w:r>
       <w:r>
-        <w:t xml:space="preserve">  - Q: 'medicalRag' 문서의 주요 목적과 핵심 요약은 무엇입니까?</w:t>
+        <w:t xml:space="preserve">  - Q: 'MCP' 문서의 주요 목적과 핵심 요약은 무엇입니까?</w:t>
         <w:br/>
       </w:r>
       <w:r>
-        <w:t xml:space="preserve">    A: 본 문서는 '학술 논문' 유형으로 분류되며, 주요 요약 내용은 다음과 같습니다: MEDICAL GRAPH RAG: T OWARDS SAFE MEDICAL LARGE LANGUAGE MODEL VIA GRAPH RETRIEVAL - AUGMENTED GENERATION Junde Wu University of Oxford jundewu@ieee.org Jiayuan Zhu University of Ox...</w:t>
+        <w:t xml:space="preserve">    A: 본 문서는 '기술 설계 문서' 유형으로 분류되며, 주요 요약 내용은 다음과 같습니다: MCP(모델 컨텍스트 프로토콜)란 무엇인가? 작동 원리 주요 생태계 구성원 관련 기술과의 비교 (AI 엔지니어를 위한 심층 분석) Notion MCP 서버란 무엇인가? 두 가지 형태 작동 아키텍처 Notion MCP 서버의 핵심 기능 (Key Features) Notion MCP 서버 사용 방법 (단계별 설정 가이드) 1...</w:t>
         <w:br/>
       </w:r>
       <w:r>
-        <w:t xml:space="preserve">  - Q: 'medicalRag' 문서에서 도출할 수 있는 실무 적용 포인트는 무엇입니까?</w:t>
+        <w:t xml:space="preserve">  - Q: 'MCP' 문서에서 도출할 수 있는 실무 적용 포인트는 무엇입니까?</w:t>
         <w:br/>
       </w:r>
       <w:r>
-        <w:t xml:space="preserve">    A: 문서의 텍스트 구성 성분을 분석한 결과, 발행 연도 2019년 기준의 로컬 소머즈 문서고 관련 지식 자산입니다. 분석 결과에 기반해 설계 검토 및 URS 사양 검증에 참고하시기 바랍니다.</w:t>
+        <w:t xml:space="preserve">    A: 문서의 텍스트 구성 성분을 분석한 결과, 발행 연도 2024년 기준의 로컬 소머즈 문서고 관련 지식 자산입니다. 분석 결과에 기반해 설계 검토 및 URS 사양 검증에 참고하시기 바랍니다.</w:t>
         <w:br/>
       </w:r>
     </w:p>
@@ -1037,7 +913,7 @@
         <w:pStyle w:val="Heading2"/>
       </w:pPr>
       <w:r>
-        <w:t>■ Natural_Language_Processing_with_Transformers_Building_Language_Applications_with_Hugging_Face_by_Lewis_Tunstall__Leandro_von_Werra__Thomas_Wolf</w:t>
+        <w:t>■ Measuring the Effect on Human-Like Agenda Generation</w:t>
       </w:r>
     </w:p>
     <w:p>
@@ -1048,7 +924,7 @@
         <w:t xml:space="preserve">• 출처 및 유형: </w:t>
       </w:r>
       <w:r>
-        <w:t>로컬 소머즈 문서고 (2022) | 학술 논문</w:t>
+        <w:t>FDA (2015) | 학술 논문</w:t>
         <w:br/>
       </w:r>
       <w:r>
@@ -1059,7 +935,7 @@
         <w:br/>
       </w:r>
       <w:r>
-        <w:t xml:space="preserve">  Praise for Natural Language Processing with Transformers Pretrained transformer language models have taken the NLP world by storm, while libraries such as   Transformers have made ...</w:t>
+        <w:t xml:space="preserve">  Inducing Personality in LLM-Based Honeypot Agents: Measuring the Effect on Human-Like Agenda Generation Lewis Newsham and Ryan Hyland and Daniel Prince School of Computing and Comm...</w:t>
         <w:br/>
       </w:r>
       <w:r>
@@ -1070,135 +946,19 @@
         <w:br/>
       </w:r>
       <w:r>
-        <w:t xml:space="preserve">  - Q: 'Natural_Language_Processing_with_Transformers_Building_Language_Applications_with_Hugging_Face_by_Lewis_Tunstall__Leandro_von_Werra__Thomas_Wolf' 문서의 주요 목적과 핵심 요약은 무엇입니까?</w:t>
+        <w:t xml:space="preserve">  - Q: 'Measuring the Effect on Human-Like Agenda Generation' 문서의 주요 목적과 핵심 요약은 무엇입니까?</w:t>
         <w:br/>
       </w:r>
       <w:r>
-        <w:t xml:space="preserve">    A: 본 문서는 '학술 논문' 유형으로 분류되며, 주요 요약 내용은 다음과 같습니다: Praise for Natural Language Processing with Transformers Pretrained transformer language models have taken the NLP world by storm, while libraries such as   Transformers have made ...</w:t>
+        <w:t xml:space="preserve">    A: 본 문서는 '학술 논문' 유형으로 분류되며, 주요 요약 내용은 다음과 같습니다: Inducing Personality in LLM-Based Honeypot Agents: Measuring the Effect on Human-Like Agenda Generation Lewis Newsham and Ryan Hyland and Daniel Prince School of Computing and Comm...</w:t>
         <w:br/>
       </w:r>
       <w:r>
-        <w:t xml:space="preserve">  - Q: 'Natural_Language_Processing_with_Transformers_Building_Language_Applications_with_Hugging_Face_by_Lewis_Tunstall__Leandro_von_Werra__Thomas_Wolf' 문서에서 도출할 수 있는 실무 적용 포인트는 무엇입니까?</w:t>
+        <w:t xml:space="preserve">  - Q: 'Measuring the Effect on Human-Like Agenda Generation' 문서에서 도출할 수 있는 실무 적용 포인트는 무엇입니까?</w:t>
         <w:br/>
       </w:r>
       <w:r>
-        <w:t xml:space="preserve">    A: 문서의 텍스트 구성 성분을 분석한 결과, 발행 연도 2022년 기준의 로컬 소머즈 문서고 관련 지식 자산입니다. 분석 결과에 기반해 설계 검토 및 URS 사양 검증에 참고하시기 바랍니다.</w:t>
-        <w:br/>
-      </w:r>
-    </w:p>
-    <w:p>
-      <w:pPr>
-        <w:pStyle w:val="Heading2"/>
-      </w:pPr>
-      <w:r>
-        <w:t>■ RAG</w:t>
-      </w:r>
-    </w:p>
-    <w:p>
-      <w:r>
-        <w:rPr>
-          <w:b/>
-        </w:rPr>
-        <w:t xml:space="preserve">• 출처 및 유형: </w:t>
-      </w:r>
-      <w:r>
-        <w:t>로컬 소머즈 문서고 (2018) | 학술 논문</w:t>
-        <w:br/>
-      </w:r>
-      <w:r>
-        <w:rPr>
-          <w:b/>
-        </w:rPr>
-        <w:t>• 핵심 내용 요약:</w:t>
-        <w:br/>
-      </w:r>
-      <w:r>
-        <w:t xml:space="preserve">  Retrieval-Augmented Generation for Knowledge-Intensive NLP Tasks Patrick Lewis†‡, Ethan Perez⋆, Aleksandra Piktus†, Fabio Petroni†, Vladimir Karpukhin†, Naman Goyal†, Heinrich Kütt...</w:t>
-        <w:br/>
-      </w:r>
-      <w:r>
-        <w:rPr>
-          <w:b/>
-        </w:rPr>
-        <w:t>• AI 학습용 핵심 Q&amp;A:</w:t>
-        <w:br/>
-      </w:r>
-      <w:r>
-        <w:t xml:space="preserve">  - Q: 'RAG' 문서의 주요 목적과 핵심 요약은 무엇입니까?</w:t>
-        <w:br/>
-      </w:r>
-      <w:r>
-        <w:t xml:space="preserve">    A: 본 문서는 '학술 논문' 유형으로 분류되며, 주요 요약 내용은 다음과 같습니다: Retrieval-Augmented Generation for Knowledge-Intensive NLP Tasks Patrick Lewis†‡, Ethan Perez⋆, Aleksandra Piktus†, Fabio Petroni†, Vladimir Karpukhin†, Naman Goyal†, Heinrich Kütt...</w:t>
-        <w:br/>
-      </w:r>
-      <w:r>
-        <w:t xml:space="preserve">  - Q: 'RAG' 문서에서 도출할 수 있는 실무 적용 포인트는 무엇입니까?</w:t>
-        <w:br/>
-      </w:r>
-      <w:r>
-        <w:t xml:space="preserve">    A: 문서의 텍스트 구성 성분을 분석한 결과, 발행 연도 2018년 기준의 로컬 소머즈 문서고 관련 지식 자산입니다. 분석 결과에 기반해 설계 검토 및 URS 사양 검증에 참고하시기 바랍니다.</w:t>
-        <w:br/>
-      </w:r>
-    </w:p>
-    <w:p>
-      <w:pPr>
-        <w:pStyle w:val="Heading2"/>
-      </w:pPr>
-      <w:r>
-        <w:t>■ 인공지능에 관한 산업 동향 및 학술 보고서</w:t>
-      </w:r>
-    </w:p>
-    <w:p>
-      <w:r>
-        <w:rPr>
-          <w:b/>
-        </w:rPr>
-        <w:t xml:space="preserve">• 출처 및 유형: </w:t>
-      </w:r>
-      <w:r>
-        <w:t>한국학술지인용색인 (KCI) (2024) | 학술 논문</w:t>
-        <w:br/>
-      </w:r>
-      <w:r>
-        <w:rPr>
-          <w:b/>
-        </w:rPr>
-        <w:t>• 핵심 내용 요약:</w:t>
-        <w:br/>
-      </w:r>
-      <w:r>
-        <w:t xml:space="preserve">  인공지능의 기초 기술 분석과 최신 적용 표준 분석 내용.</w:t>
-        <w:br/>
-      </w:r>
-      <w:r>
-        <w:rPr>
-          <w:b/>
-        </w:rPr>
-        <w:t>• AI 학습용 핵심 Q&amp;A:</w:t>
-        <w:br/>
-      </w:r>
-      <w:r>
-        <w:t xml:space="preserve">  - Q: 인공지능에 관한 산업 동향 및 학술 보고서의 핵심 설계/검토 기준은 무엇입니까?</w:t>
-        <w:br/>
-      </w:r>
-      <w:r>
-        <w:t xml:space="preserve">    A: 실무 적용 포인트 및 핵심 기술 사양이 요약됨.</w:t>
-        <w:br/>
-      </w:r>
-      <w:r>
-        <w:t xml:space="preserve">  - Q: 인공지능에 관한 산업 동향 및 학술 보고서 문서의 신뢰성과 출처 정보는 어떻게 됩니까?</w:t>
-        <w:br/>
-      </w:r>
-      <w:r>
-        <w:t xml:space="preserve">    A: 본 문서는 2024년 한국학술지인용색인 (KCI)에서 발행된 학술 논문로, 신뢰도 등급은 ★★★★☆ 입니다.</w:t>
-        <w:br/>
-      </w:r>
-      <w:r>
-        <w:t xml:space="preserve">  - Q: 이 지식을 활용할 때 사용자의 요청사항인 '전문기술근거' 측면에서 검토해야 할 점은 무엇입니까?</w:t>
-        <w:br/>
-      </w:r>
-      <w:r>
-        <w:t xml:space="preserve">    A: 문서의 분석 결과, 실무 적용 포인트 및 핵심 기술 사양이 요약됨.에 기반하여 사용자가 기재한 조건인 '전문기술근거'에 맞추어 의사결정을 지원합니다.</w:t>
+        <w:t xml:space="preserve">    A: 문서의 텍스트 구성 성분을 분석한 결과, 발행 연도 2015년 기준의 FDA 관련 지식 자산입니다. 분석 결과에 기반해 설계 검토 및 URS 사양 검증에 참고하시기 바랍니다.</w:t>
         <w:br/>
       </w:r>
     </w:p>

</xml_diff>